<commit_message>
Mise à jour du projet MobiPass
</commit_message>
<xml_diff>
--- a/MobiPass_Projet/01_Dossier_conception/MobiPass_Dossier_conception.docx
+++ b/MobiPass_Projet/01_Dossier_conception/MobiPass_Dossier_conception.docx
@@ -4484,7 +4484,7 @@
           <w:sz w:val="21"/>
           <w:szCs w:val="21"/>
         </w:rPr>
-        <w:t xml:space="preserve">Nous recensons ci-dessous toutes les sources nécessaires aux deux magasins. Les sources S2 à S5 sont nouvelles par rapport à la première version du SAD ; S6 correspond à l'ED actuel, dont nous reprenons l'historique. Les schémas conceptuels des nouvelles sources sont fournis dans le fichier draw.io joint (MobiPass_Sources.drawio).</w:t>
+        <w:t xml:space="preserve">Nous recensons ci-dessous toutes les sources nécessaires aux deux magasins, avec pour chacune la page du sujet (Projet_IDA_26_27_MobiPassV2.pdf) où elle est décrite. S5 n'est pas listée telle quelle dans le sujet : nous l'avons déduite des besoins, car le ROME, la nomenclature INSEE et le découpage administratif allemand ne figurent dans aucune base de MobiPass. Les sources S2 à S5 sont nouvelles par rapport à la première version du SAD ; S6 correspond à l'ED actuel, dont nous reprenons l'historique. Chaque source a son schéma conceptuel dans le fichier MobiPass_Conception_complet.drawio : page « 2a » pour S2 et S3, page « 2b » pour S1, S4, S5 et S7, page « 2c » pour S6. Pour S1 et S4, dont le sujet ne détaille pas le contenu, le schéma traduit une hypothèse de travail soumise au client.</w:t>
       </w:r>
     </w:p>
     <w:p>
@@ -4516,13 +4516,14 @@
         </w:tblBorders>
       </w:tblPr>
       <w:tblGrid>
-        <w:gridCol w:w="700"/>
-        <w:gridCol w:w="2300"/>
-        <w:gridCol w:w="3600"/>
-        <w:gridCol w:w="2000"/>
-        <w:gridCol w:w="2200"/>
+        <w:gridCol w:w="600"/>
+        <w:gridCol w:w="1900"/>
+        <w:gridCol w:w="3100"/>
         <w:gridCol w:w="1700"/>
         <w:gridCol w:w="1700"/>
+        <w:gridCol w:w="1500"/>
+        <w:gridCol w:w="1600"/>
+        <w:gridCol w:w="2100"/>
       </w:tblGrid>
       <w:tr>
         <w:trPr>
@@ -4530,7 +4531,7 @@
         </w:trPr>
         <w:tc>
           <w:tcPr>
-            <w:tcW w:type="dxa" w:w="700"/>
+            <w:tcW w:type="dxa" w:w="600"/>
             <w:tcBorders>
               <w:top w:val="single" w:color="8EA9C1" w:sz="4"/>
               <w:left w:val="single" w:color="8EA9C1" w:sz="4"/>
@@ -4566,7 +4567,7 @@
         </w:tc>
         <w:tc>
           <w:tcPr>
-            <w:tcW w:type="dxa" w:w="2300"/>
+            <w:tcW w:type="dxa" w:w="1900"/>
             <w:tcBorders>
               <w:top w:val="single" w:color="8EA9C1" w:sz="4"/>
               <w:left w:val="single" w:color="8EA9C1" w:sz="4"/>
@@ -4602,7 +4603,7 @@
         </w:tc>
         <w:tc>
           <w:tcPr>
-            <w:tcW w:type="dxa" w:w="3600"/>
+            <w:tcW w:type="dxa" w:w="3100"/>
             <w:tcBorders>
               <w:top w:val="single" w:color="8EA9C1" w:sz="4"/>
               <w:left w:val="single" w:color="8EA9C1" w:sz="4"/>
@@ -4638,7 +4639,7 @@
         </w:tc>
         <w:tc>
           <w:tcPr>
-            <w:tcW w:type="dxa" w:w="2000"/>
+            <w:tcW w:type="dxa" w:w="1700"/>
             <w:tcBorders>
               <w:top w:val="single" w:color="8EA9C1" w:sz="4"/>
               <w:left w:val="single" w:color="8EA9C1" w:sz="4"/>
@@ -4674,7 +4675,7 @@
         </w:tc>
         <w:tc>
           <w:tcPr>
-            <w:tcW w:type="dxa" w:w="2200"/>
+            <w:tcW w:type="dxa" w:w="1700"/>
             <w:tcBorders>
               <w:top w:val="single" w:color="8EA9C1" w:sz="4"/>
               <w:left w:val="single" w:color="8EA9C1" w:sz="4"/>
@@ -4710,7 +4711,7 @@
         </w:tc>
         <w:tc>
           <w:tcPr>
-            <w:tcW w:type="dxa" w:w="1700"/>
+            <w:tcW w:type="dxa" w:w="1500"/>
             <w:tcBorders>
               <w:top w:val="single" w:color="8EA9C1" w:sz="4"/>
               <w:left w:val="single" w:color="8EA9C1" w:sz="4"/>
@@ -4746,7 +4747,7 @@
         </w:tc>
         <w:tc>
           <w:tcPr>
-            <w:tcW w:type="dxa" w:w="1700"/>
+            <w:tcW w:type="dxa" w:w="1600"/>
             <w:tcBorders>
               <w:top w:val="single" w:color="8EA9C1" w:sz="4"/>
               <w:left w:val="single" w:color="8EA9C1" w:sz="4"/>
@@ -4777,6 +4778,42 @@
                 <w:szCs w:val="18"/>
               </w:rPr>
               <w:t xml:space="preserve">Support / fréquence</w:t>
+            </w:r>
+          </w:p>
+        </w:tc>
+        <w:tc>
+          <w:tcPr>
+            <w:tcW w:type="dxa" w:w="2100"/>
+            <w:tcBorders>
+              <w:top w:val="single" w:color="8EA9C1" w:sz="4"/>
+              <w:left w:val="single" w:color="8EA9C1" w:sz="4"/>
+              <w:bottom w:val="single" w:color="8EA9C1" w:sz="4"/>
+              <w:right w:val="single" w:color="8EA9C1" w:sz="4"/>
+            </w:tcBorders>
+            <w:shd w:fill="1F4E79" w:color="auto" w:val="clear"/>
+            <w:tcMar>
+              <w:top w:type="dxa" w:w="60"/>
+              <w:left w:type="dxa" w:w="90"/>
+              <w:bottom w:type="dxa" w:w="60"/>
+              <w:right w:type="dxa" w:w="90"/>
+            </w:tcMar>
+            <w:vAlign w:val="center"/>
+          </w:tcPr>
+          <w:p>
+            <w:pPr>
+              <w:spacing w:after="0"/>
+              <w:jc w:val="center"/>
+            </w:pPr>
+            <w:r>
+              <w:rPr>
+                <w:rFonts w:ascii="Calibri" w:cs="Calibri" w:eastAsia="Calibri" w:hAnsi="Calibri"/>
+                <w:b/>
+                <w:bCs/>
+                <w:color w:val="FFFFFF"/>
+                <w:sz w:val="18"/>
+                <w:szCs w:val="18"/>
+              </w:rPr>
+              <w:t xml:space="preserve">Référence dans le sujet</w:t>
             </w:r>
           </w:p>
         </w:tc>
@@ -4787,7 +4824,7 @@
         </w:trPr>
         <w:tc>
           <w:tcPr>
-            <w:tcW w:type="dxa" w:w="700"/>
+            <w:tcW w:type="dxa" w:w="600"/>
             <w:tcBorders>
               <w:top w:val="single" w:color="8EA9C1" w:sz="4"/>
               <w:left w:val="single" w:color="8EA9C1" w:sz="4"/>
@@ -4822,7 +4859,7 @@
         </w:tc>
         <w:tc>
           <w:tcPr>
-            <w:tcW w:type="dxa" w:w="2300"/>
+            <w:tcW w:type="dxa" w:w="1900"/>
             <w:tcBorders>
               <w:top w:val="single" w:color="8EA9C1" w:sz="4"/>
               <w:left w:val="single" w:color="8EA9C1" w:sz="4"/>
@@ -4855,7 +4892,7 @@
         </w:tc>
         <w:tc>
           <w:tcPr>
-            <w:tcW w:type="dxa" w:w="3600"/>
+            <w:tcW w:type="dxa" w:w="3100"/>
             <w:tcBorders>
               <w:top w:val="single" w:color="8EA9C1" w:sz="4"/>
               <w:left w:val="single" w:color="8EA9C1" w:sz="4"/>
@@ -4888,7 +4925,7 @@
         </w:tc>
         <w:tc>
           <w:tcPr>
-            <w:tcW w:type="dxa" w:w="2000"/>
+            <w:tcW w:type="dxa" w:w="1700"/>
             <w:tcBorders>
               <w:top w:val="single" w:color="8EA9C1" w:sz="4"/>
               <w:left w:val="single" w:color="8EA9C1" w:sz="4"/>
@@ -4921,7 +4958,7 @@
         </w:tc>
         <w:tc>
           <w:tcPr>
-            <w:tcW w:type="dxa" w:w="2200"/>
+            <w:tcW w:type="dxa" w:w="1700"/>
             <w:tcBorders>
               <w:top w:val="single" w:color="8EA9C1" w:sz="4"/>
               <w:left w:val="single" w:color="8EA9C1" w:sz="4"/>
@@ -4954,7 +4991,7 @@
         </w:tc>
         <w:tc>
           <w:tcPr>
-            <w:tcW w:type="dxa" w:w="1700"/>
+            <w:tcW w:type="dxa" w:w="1500"/>
             <w:tcBorders>
               <w:top w:val="single" w:color="8EA9C1" w:sz="4"/>
               <w:left w:val="single" w:color="8EA9C1" w:sz="4"/>
@@ -4987,7 +5024,7 @@
         </w:tc>
         <w:tc>
           <w:tcPr>
-            <w:tcW w:type="dxa" w:w="1700"/>
+            <w:tcW w:type="dxa" w:w="1600"/>
             <w:tcBorders>
               <w:top w:val="single" w:color="8EA9C1" w:sz="4"/>
               <w:left w:val="single" w:color="8EA9C1" w:sz="4"/>
@@ -5015,6 +5052,39 @@
                 <w:szCs w:val="18"/>
               </w:rPr>
               <w:t xml:space="preserve">Extraction · quotidienne</w:t>
+            </w:r>
+          </w:p>
+        </w:tc>
+        <w:tc>
+          <w:tcPr>
+            <w:tcW w:type="dxa" w:w="2100"/>
+            <w:tcBorders>
+              <w:top w:val="single" w:color="8EA9C1" w:sz="4"/>
+              <w:left w:val="single" w:color="8EA9C1" w:sz="4"/>
+              <w:bottom w:val="single" w:color="8EA9C1" w:sz="4"/>
+              <w:right w:val="single" w:color="8EA9C1" w:sz="4"/>
+            </w:tcBorders>
+            <w:tcMar>
+              <w:top w:type="dxa" w:w="60"/>
+              <w:left w:type="dxa" w:w="90"/>
+              <w:bottom w:type="dxa" w:w="60"/>
+              <w:right w:type="dxa" w:w="90"/>
+            </w:tcMar>
+            <w:vAlign w:val="center"/>
+          </w:tcPr>
+          <w:p>
+            <w:pPr>
+              <w:spacing w:after="0"/>
+            </w:pPr>
+            <w:r>
+              <w:rPr>
+                <w:rFonts w:ascii="Calibri" w:cs="Calibri" w:eastAsia="Calibri" w:hAnsi="Calibri"/>
+                <w:i w:val="false"/>
+                <w:iCs w:val="false"/>
+                <w:sz w:val="18"/>
+                <w:szCs w:val="18"/>
+              </w:rPr>
+              <w:t xml:space="preserve">p. 2 (Le système décisionnel en place)</w:t>
             </w:r>
           </w:p>
         </w:tc>
@@ -5025,7 +5095,7 @@
         </w:trPr>
         <w:tc>
           <w:tcPr>
-            <w:tcW w:type="dxa" w:w="700"/>
+            <w:tcW w:type="dxa" w:w="600"/>
             <w:tcBorders>
               <w:top w:val="single" w:color="8EA9C1" w:sz="4"/>
               <w:left w:val="single" w:color="8EA9C1" w:sz="4"/>
@@ -5060,7 +5130,7 @@
         </w:tc>
         <w:tc>
           <w:tcPr>
-            <w:tcW w:type="dxa" w:w="2300"/>
+            <w:tcW w:type="dxa" w:w="1900"/>
             <w:tcBorders>
               <w:top w:val="single" w:color="8EA9C1" w:sz="4"/>
               <w:left w:val="single" w:color="8EA9C1" w:sz="4"/>
@@ -5093,7 +5163,7 @@
         </w:tc>
         <w:tc>
           <w:tcPr>
-            <w:tcW w:type="dxa" w:w="3600"/>
+            <w:tcW w:type="dxa" w:w="3100"/>
             <w:tcBorders>
               <w:top w:val="single" w:color="8EA9C1" w:sz="4"/>
               <w:left w:val="single" w:color="8EA9C1" w:sz="4"/>
@@ -5126,7 +5196,7 @@
         </w:tc>
         <w:tc>
           <w:tcPr>
-            <w:tcW w:type="dxa" w:w="2000"/>
+            <w:tcW w:type="dxa" w:w="1700"/>
             <w:tcBorders>
               <w:top w:val="single" w:color="8EA9C1" w:sz="4"/>
               <w:left w:val="single" w:color="8EA9C1" w:sz="4"/>
@@ -5159,7 +5229,7 @@
         </w:tc>
         <w:tc>
           <w:tcPr>
-            <w:tcW w:type="dxa" w:w="2200"/>
+            <w:tcW w:type="dxa" w:w="1700"/>
             <w:tcBorders>
               <w:top w:val="single" w:color="8EA9C1" w:sz="4"/>
               <w:left w:val="single" w:color="8EA9C1" w:sz="4"/>
@@ -5192,7 +5262,7 @@
         </w:tc>
         <w:tc>
           <w:tcPr>
-            <w:tcW w:type="dxa" w:w="1700"/>
+            <w:tcW w:type="dxa" w:w="1500"/>
             <w:tcBorders>
               <w:top w:val="single" w:color="8EA9C1" w:sz="4"/>
               <w:left w:val="single" w:color="8EA9C1" w:sz="4"/>
@@ -5225,7 +5295,7 @@
         </w:tc>
         <w:tc>
           <w:tcPr>
-            <w:tcW w:type="dxa" w:w="1700"/>
+            <w:tcW w:type="dxa" w:w="1600"/>
             <w:tcBorders>
               <w:top w:val="single" w:color="8EA9C1" w:sz="4"/>
               <w:left w:val="single" w:color="8EA9C1" w:sz="4"/>
@@ -5253,6 +5323,39 @@
                 <w:szCs w:val="18"/>
               </w:rPr>
               <w:t xml:space="preserve">Accès direct · quotidienne</w:t>
+            </w:r>
+          </w:p>
+        </w:tc>
+        <w:tc>
+          <w:tcPr>
+            <w:tcW w:type="dxa" w:w="2100"/>
+            <w:tcBorders>
+              <w:top w:val="single" w:color="8EA9C1" w:sz="4"/>
+              <w:left w:val="single" w:color="8EA9C1" w:sz="4"/>
+              <w:bottom w:val="single" w:color="8EA9C1" w:sz="4"/>
+              <w:right w:val="single" w:color="8EA9C1" w:sz="4"/>
+            </w:tcBorders>
+            <w:tcMar>
+              <w:top w:type="dxa" w:w="60"/>
+              <w:left w:type="dxa" w:w="90"/>
+              <w:bottom w:type="dxa" w:w="60"/>
+              <w:right w:type="dxa" w:w="90"/>
+            </w:tcMar>
+            <w:vAlign w:val="center"/>
+          </w:tcPr>
+          <w:p>
+            <w:pPr>
+              <w:spacing w:after="0"/>
+            </w:pPr>
+            <w:r>
+              <w:rPr>
+                <w:rFonts w:ascii="Calibri" w:cs="Calibri" w:eastAsia="Calibri" w:hAnsi="Calibri"/>
+                <w:i w:val="false"/>
+                <w:iCs w:val="false"/>
+                <w:sz w:val="18"/>
+                <w:szCs w:val="18"/>
+              </w:rPr>
+              <w:t xml:space="preserve">p. 2 et p. 6 (Le système de gestion du catalogue et du parc)</w:t>
             </w:r>
           </w:p>
         </w:tc>
@@ -5263,7 +5366,7 @@
         </w:trPr>
         <w:tc>
           <w:tcPr>
-            <w:tcW w:type="dxa" w:w="700"/>
+            <w:tcW w:type="dxa" w:w="600"/>
             <w:tcBorders>
               <w:top w:val="single" w:color="8EA9C1" w:sz="4"/>
               <w:left w:val="single" w:color="8EA9C1" w:sz="4"/>
@@ -5298,7 +5401,7 @@
         </w:tc>
         <w:tc>
           <w:tcPr>
-            <w:tcW w:type="dxa" w:w="2300"/>
+            <w:tcW w:type="dxa" w:w="1900"/>
             <w:tcBorders>
               <w:top w:val="single" w:color="8EA9C1" w:sz="4"/>
               <w:left w:val="single" w:color="8EA9C1" w:sz="4"/>
@@ -5331,7 +5434,7 @@
         </w:tc>
         <w:tc>
           <w:tcPr>
-            <w:tcW w:type="dxa" w:w="3600"/>
+            <w:tcW w:type="dxa" w:w="3100"/>
             <w:tcBorders>
               <w:top w:val="single" w:color="8EA9C1" w:sz="4"/>
               <w:left w:val="single" w:color="8EA9C1" w:sz="4"/>
@@ -5364,7 +5467,7 @@
         </w:tc>
         <w:tc>
           <w:tcPr>
-            <w:tcW w:type="dxa" w:w="2000"/>
+            <w:tcW w:type="dxa" w:w="1700"/>
             <w:tcBorders>
               <w:top w:val="single" w:color="8EA9C1" w:sz="4"/>
               <w:left w:val="single" w:color="8EA9C1" w:sz="4"/>
@@ -5397,7 +5500,7 @@
         </w:tc>
         <w:tc>
           <w:tcPr>
-            <w:tcW w:type="dxa" w:w="2200"/>
+            <w:tcW w:type="dxa" w:w="1700"/>
             <w:tcBorders>
               <w:top w:val="single" w:color="8EA9C1" w:sz="4"/>
               <w:left w:val="single" w:color="8EA9C1" w:sz="4"/>
@@ -5430,7 +5533,7 @@
         </w:tc>
         <w:tc>
           <w:tcPr>
-            <w:tcW w:type="dxa" w:w="1700"/>
+            <w:tcW w:type="dxa" w:w="1500"/>
             <w:tcBorders>
               <w:top w:val="single" w:color="8EA9C1" w:sz="4"/>
               <w:left w:val="single" w:color="8EA9C1" w:sz="4"/>
@@ -5463,7 +5566,7 @@
         </w:tc>
         <w:tc>
           <w:tcPr>
-            <w:tcW w:type="dxa" w:w="1700"/>
+            <w:tcW w:type="dxa" w:w="1600"/>
             <w:tcBorders>
               <w:top w:val="single" w:color="8EA9C1" w:sz="4"/>
               <w:left w:val="single" w:color="8EA9C1" w:sz="4"/>
@@ -5491,6 +5594,39 @@
                 <w:szCs w:val="18"/>
               </w:rPr>
               <w:t xml:space="preserve">Extraction · mensuelle</w:t>
+            </w:r>
+          </w:p>
+        </w:tc>
+        <w:tc>
+          <w:tcPr>
+            <w:tcW w:type="dxa" w:w="2100"/>
+            <w:tcBorders>
+              <w:top w:val="single" w:color="8EA9C1" w:sz="4"/>
+              <w:left w:val="single" w:color="8EA9C1" w:sz="4"/>
+              <w:bottom w:val="single" w:color="8EA9C1" w:sz="4"/>
+              <w:right w:val="single" w:color="8EA9C1" w:sz="4"/>
+            </w:tcBorders>
+            <w:tcMar>
+              <w:top w:type="dxa" w:w="60"/>
+              <w:left w:type="dxa" w:w="90"/>
+              <w:bottom w:type="dxa" w:w="60"/>
+              <w:right w:type="dxa" w:w="90"/>
+            </w:tcMar>
+            <w:vAlign w:val="center"/>
+          </w:tcPr>
+          <w:p>
+            <w:pPr>
+              <w:spacing w:after="0"/>
+            </w:pPr>
+            <w:r>
+              <w:rPr>
+                <w:rFonts w:ascii="Calibri" w:cs="Calibri" w:eastAsia="Calibri" w:hAnsi="Calibri"/>
+                <w:i w:val="false"/>
+                <w:iCs w:val="false"/>
+                <w:sz w:val="18"/>
+                <w:szCs w:val="18"/>
+              </w:rPr>
+              <w:t xml:space="preserve">p. 5 et 6 (Le portail RH des sociétés clientes)</w:t>
             </w:r>
           </w:p>
         </w:tc>
@@ -5501,7 +5637,7 @@
         </w:trPr>
         <w:tc>
           <w:tcPr>
-            <w:tcW w:type="dxa" w:w="700"/>
+            <w:tcW w:type="dxa" w:w="600"/>
             <w:tcBorders>
               <w:top w:val="single" w:color="8EA9C1" w:sz="4"/>
               <w:left w:val="single" w:color="8EA9C1" w:sz="4"/>
@@ -5536,7 +5672,7 @@
         </w:tc>
         <w:tc>
           <w:tcPr>
-            <w:tcW w:type="dxa" w:w="2300"/>
+            <w:tcW w:type="dxa" w:w="1900"/>
             <w:tcBorders>
               <w:top w:val="single" w:color="8EA9C1" w:sz="4"/>
               <w:left w:val="single" w:color="8EA9C1" w:sz="4"/>
@@ -5569,7 +5705,7 @@
         </w:tc>
         <w:tc>
           <w:tcPr>
-            <w:tcW w:type="dxa" w:w="3600"/>
+            <w:tcW w:type="dxa" w:w="3100"/>
             <w:tcBorders>
               <w:top w:val="single" w:color="8EA9C1" w:sz="4"/>
               <w:left w:val="single" w:color="8EA9C1" w:sz="4"/>
@@ -5602,7 +5738,7 @@
         </w:tc>
         <w:tc>
           <w:tcPr>
-            <w:tcW w:type="dxa" w:w="2000"/>
+            <w:tcW w:type="dxa" w:w="1700"/>
             <w:tcBorders>
               <w:top w:val="single" w:color="8EA9C1" w:sz="4"/>
               <w:left w:val="single" w:color="8EA9C1" w:sz="4"/>
@@ -5635,7 +5771,7 @@
         </w:tc>
         <w:tc>
           <w:tcPr>
-            <w:tcW w:type="dxa" w:w="2200"/>
+            <w:tcW w:type="dxa" w:w="1700"/>
             <w:tcBorders>
               <w:top w:val="single" w:color="8EA9C1" w:sz="4"/>
               <w:left w:val="single" w:color="8EA9C1" w:sz="4"/>
@@ -5668,7 +5804,7 @@
         </w:tc>
         <w:tc>
           <w:tcPr>
-            <w:tcW w:type="dxa" w:w="1700"/>
+            <w:tcW w:type="dxa" w:w="1500"/>
             <w:tcBorders>
               <w:top w:val="single" w:color="8EA9C1" w:sz="4"/>
               <w:left w:val="single" w:color="8EA9C1" w:sz="4"/>
@@ -5701,7 +5837,7 @@
         </w:tc>
         <w:tc>
           <w:tcPr>
-            <w:tcW w:type="dxa" w:w="1700"/>
+            <w:tcW w:type="dxa" w:w="1600"/>
             <w:tcBorders>
               <w:top w:val="single" w:color="8EA9C1" w:sz="4"/>
               <w:left w:val="single" w:color="8EA9C1" w:sz="4"/>
@@ -5729,6 +5865,39 @@
                 <w:szCs w:val="18"/>
               </w:rPr>
               <w:t xml:space="preserve">Dépôt de fichier · à chaque envoi</w:t>
+            </w:r>
+          </w:p>
+        </w:tc>
+        <w:tc>
+          <w:tcPr>
+            <w:tcW w:type="dxa" w:w="2100"/>
+            <w:tcBorders>
+              <w:top w:val="single" w:color="8EA9C1" w:sz="4"/>
+              <w:left w:val="single" w:color="8EA9C1" w:sz="4"/>
+              <w:bottom w:val="single" w:color="8EA9C1" w:sz="4"/>
+              <w:right w:val="single" w:color="8EA9C1" w:sz="4"/>
+            </w:tcBorders>
+            <w:tcMar>
+              <w:top w:type="dxa" w:w="60"/>
+              <w:left w:type="dxa" w:w="90"/>
+              <w:bottom w:type="dxa" w:w="60"/>
+              <w:right w:type="dxa" w:w="90"/>
+            </w:tcMar>
+            <w:vAlign w:val="center"/>
+          </w:tcPr>
+          <w:p>
+            <w:pPr>
+              <w:spacing w:after="0"/>
+            </w:pPr>
+            <w:r>
+              <w:rPr>
+                <w:rFonts w:ascii="Calibri" w:cs="Calibri" w:eastAsia="Calibri" w:hAnsi="Calibri"/>
+                <w:i w:val="false"/>
+                <w:iCs w:val="false"/>
+                <w:sz w:val="18"/>
+                <w:szCs w:val="18"/>
+              </w:rPr>
+              <w:t xml:space="preserve">p. 4 (Retour d'expérience) et p. 6 (dernier point du portail RH)</w:t>
             </w:r>
           </w:p>
         </w:tc>
@@ -5739,7 +5908,7 @@
         </w:trPr>
         <w:tc>
           <w:tcPr>
-            <w:tcW w:type="dxa" w:w="700"/>
+            <w:tcW w:type="dxa" w:w="600"/>
             <w:tcBorders>
               <w:top w:val="single" w:color="8EA9C1" w:sz="4"/>
               <w:left w:val="single" w:color="8EA9C1" w:sz="4"/>
@@ -5774,7 +5943,7 @@
         </w:tc>
         <w:tc>
           <w:tcPr>
-            <w:tcW w:type="dxa" w:w="2300"/>
+            <w:tcW w:type="dxa" w:w="1900"/>
             <w:tcBorders>
               <w:top w:val="single" w:color="8EA9C1" w:sz="4"/>
               <w:left w:val="single" w:color="8EA9C1" w:sz="4"/>
@@ -5807,7 +5976,7 @@
         </w:tc>
         <w:tc>
           <w:tcPr>
-            <w:tcW w:type="dxa" w:w="3600"/>
+            <w:tcW w:type="dxa" w:w="3100"/>
             <w:tcBorders>
               <w:top w:val="single" w:color="8EA9C1" w:sz="4"/>
               <w:left w:val="single" w:color="8EA9C1" w:sz="4"/>
@@ -5840,7 +6009,7 @@
         </w:tc>
         <w:tc>
           <w:tcPr>
-            <w:tcW w:type="dxa" w:w="2000"/>
+            <w:tcW w:type="dxa" w:w="1700"/>
             <w:tcBorders>
               <w:top w:val="single" w:color="8EA9C1" w:sz="4"/>
               <w:left w:val="single" w:color="8EA9C1" w:sz="4"/>
@@ -5873,7 +6042,7 @@
         </w:tc>
         <w:tc>
           <w:tcPr>
-            <w:tcW w:type="dxa" w:w="2200"/>
+            <w:tcW w:type="dxa" w:w="1700"/>
             <w:tcBorders>
               <w:top w:val="single" w:color="8EA9C1" w:sz="4"/>
               <w:left w:val="single" w:color="8EA9C1" w:sz="4"/>
@@ -5906,7 +6075,7 @@
         </w:tc>
         <w:tc>
           <w:tcPr>
-            <w:tcW w:type="dxa" w:w="1700"/>
+            <w:tcW w:type="dxa" w:w="1500"/>
             <w:tcBorders>
               <w:top w:val="single" w:color="8EA9C1" w:sz="4"/>
               <w:left w:val="single" w:color="8EA9C1" w:sz="4"/>
@@ -5939,7 +6108,7 @@
         </w:tc>
         <w:tc>
           <w:tcPr>
-            <w:tcW w:type="dxa" w:w="1700"/>
+            <w:tcW w:type="dxa" w:w="1600"/>
             <w:tcBorders>
               <w:top w:val="single" w:color="8EA9C1" w:sz="4"/>
               <w:left w:val="single" w:color="8EA9C1" w:sz="4"/>
@@ -5967,6 +6136,39 @@
                 <w:szCs w:val="18"/>
               </w:rPr>
               <w:t xml:space="preserve">Téléchargement · ponctuel</w:t>
+            </w:r>
+          </w:p>
+        </w:tc>
+        <w:tc>
+          <w:tcPr>
+            <w:tcW w:type="dxa" w:w="2100"/>
+            <w:tcBorders>
+              <w:top w:val="single" w:color="8EA9C1" w:sz="4"/>
+              <w:left w:val="single" w:color="8EA9C1" w:sz="4"/>
+              <w:bottom w:val="single" w:color="8EA9C1" w:sz="4"/>
+              <w:right w:val="single" w:color="8EA9C1" w:sz="4"/>
+            </w:tcBorders>
+            <w:tcMar>
+              <w:top w:type="dxa" w:w="60"/>
+              <w:left w:type="dxa" w:w="90"/>
+              <w:bottom w:type="dxa" w:w="60"/>
+              <w:right w:type="dxa" w:w="90"/>
+            </w:tcMar>
+            <w:vAlign w:val="center"/>
+          </w:tcPr>
+          <w:p>
+            <w:pPr>
+              <w:spacing w:after="0"/>
+            </w:pPr>
+            <w:r>
+              <w:rPr>
+                <w:rFonts w:ascii="Calibri" w:cs="Calibri" w:eastAsia="Calibri" w:hAnsi="Calibri"/>
+                <w:i w:val="false"/>
+                <w:iCs w:val="false"/>
+                <w:sz w:val="18"/>
+                <w:szCs w:val="18"/>
+              </w:rPr>
+              <w:t xml:space="preserve">Déduction à partir des besoins : ROME p. 5, INSEE p. 6, Allemagne p. 6 et 7 (figure 2)</w:t>
             </w:r>
           </w:p>
         </w:tc>
@@ -5977,7 +6179,7 @@
         </w:trPr>
         <w:tc>
           <w:tcPr>
-            <w:tcW w:type="dxa" w:w="700"/>
+            <w:tcW w:type="dxa" w:w="600"/>
             <w:tcBorders>
               <w:top w:val="single" w:color="8EA9C1" w:sz="4"/>
               <w:left w:val="single" w:color="8EA9C1" w:sz="4"/>
@@ -6012,7 +6214,7 @@
         </w:tc>
         <w:tc>
           <w:tcPr>
-            <w:tcW w:type="dxa" w:w="2300"/>
+            <w:tcW w:type="dxa" w:w="1900"/>
             <w:tcBorders>
               <w:top w:val="single" w:color="8EA9C1" w:sz="4"/>
               <w:left w:val="single" w:color="8EA9C1" w:sz="4"/>
@@ -6045,7 +6247,7 @@
         </w:tc>
         <w:tc>
           <w:tcPr>
-            <w:tcW w:type="dxa" w:w="3600"/>
+            <w:tcW w:type="dxa" w:w="3100"/>
             <w:tcBorders>
               <w:top w:val="single" w:color="8EA9C1" w:sz="4"/>
               <w:left w:val="single" w:color="8EA9C1" w:sz="4"/>
@@ -6078,7 +6280,7 @@
         </w:tc>
         <w:tc>
           <w:tcPr>
-            <w:tcW w:type="dxa" w:w="2000"/>
+            <w:tcW w:type="dxa" w:w="1700"/>
             <w:tcBorders>
               <w:top w:val="single" w:color="8EA9C1" w:sz="4"/>
               <w:left w:val="single" w:color="8EA9C1" w:sz="4"/>
@@ -6111,7 +6313,7 @@
         </w:tc>
         <w:tc>
           <w:tcPr>
-            <w:tcW w:type="dxa" w:w="2200"/>
+            <w:tcW w:type="dxa" w:w="1700"/>
             <w:tcBorders>
               <w:top w:val="single" w:color="8EA9C1" w:sz="4"/>
               <w:left w:val="single" w:color="8EA9C1" w:sz="4"/>
@@ -6144,7 +6346,7 @@
         </w:tc>
         <w:tc>
           <w:tcPr>
-            <w:tcW w:type="dxa" w:w="1700"/>
+            <w:tcW w:type="dxa" w:w="1500"/>
             <w:tcBorders>
               <w:top w:val="single" w:color="8EA9C1" w:sz="4"/>
               <w:left w:val="single" w:color="8EA9C1" w:sz="4"/>
@@ -6177,7 +6379,7 @@
         </w:tc>
         <w:tc>
           <w:tcPr>
-            <w:tcW w:type="dxa" w:w="1700"/>
+            <w:tcW w:type="dxa" w:w="1600"/>
             <w:tcBorders>
               <w:top w:val="single" w:color="8EA9C1" w:sz="4"/>
               <w:left w:val="single" w:color="8EA9C1" w:sz="4"/>
@@ -6205,6 +6407,39 @@
                 <w:szCs w:val="18"/>
               </w:rPr>
               <w:t xml:space="preserve">Reprise initiale · une fois</w:t>
+            </w:r>
+          </w:p>
+        </w:tc>
+        <w:tc>
+          <w:tcPr>
+            <w:tcW w:type="dxa" w:w="2100"/>
+            <w:tcBorders>
+              <w:top w:val="single" w:color="8EA9C1" w:sz="4"/>
+              <w:left w:val="single" w:color="8EA9C1" w:sz="4"/>
+              <w:bottom w:val="single" w:color="8EA9C1" w:sz="4"/>
+              <w:right w:val="single" w:color="8EA9C1" w:sz="4"/>
+            </w:tcBorders>
+            <w:tcMar>
+              <w:top w:type="dxa" w:w="60"/>
+              <w:left w:type="dxa" w:w="90"/>
+              <w:bottom w:type="dxa" w:w="60"/>
+              <w:right w:type="dxa" w:w="90"/>
+            </w:tcMar>
+            <w:vAlign w:val="center"/>
+          </w:tcPr>
+          <w:p>
+            <w:pPr>
+              <w:spacing w:after="0"/>
+            </w:pPr>
+            <w:r>
+              <w:rPr>
+                <w:rFonts w:ascii="Calibri" w:cs="Calibri" w:eastAsia="Calibri" w:hAnsi="Calibri"/>
+                <w:i w:val="false"/>
+                <w:iCs w:val="false"/>
+                <w:sz w:val="18"/>
+                <w:szCs w:val="18"/>
+              </w:rPr>
+              <w:t xml:space="preserve">p. 2 à 4 (figure 1, schéma relationnel) et annexes 1 à 3 p. 8 à 10</w:t>
             </w:r>
           </w:p>
         </w:tc>
@@ -6215,7 +6450,7 @@
         </w:trPr>
         <w:tc>
           <w:tcPr>
-            <w:tcW w:type="dxa" w:w="700"/>
+            <w:tcW w:type="dxa" w:w="600"/>
             <w:tcBorders>
               <w:top w:val="single" w:color="8EA9C1" w:sz="4"/>
               <w:left w:val="single" w:color="8EA9C1" w:sz="4"/>
@@ -6250,7 +6485,7 @@
         </w:tc>
         <w:tc>
           <w:tcPr>
-            <w:tcW w:type="dxa" w:w="2300"/>
+            <w:tcW w:type="dxa" w:w="1900"/>
             <w:tcBorders>
               <w:top w:val="single" w:color="8EA9C1" w:sz="4"/>
               <w:left w:val="single" w:color="8EA9C1" w:sz="4"/>
@@ -6284,7 +6519,7 @@
         </w:tc>
         <w:tc>
           <w:tcPr>
-            <w:tcW w:type="dxa" w:w="3600"/>
+            <w:tcW w:type="dxa" w:w="3100"/>
             <w:tcBorders>
               <w:top w:val="single" w:color="8EA9C1" w:sz="4"/>
               <w:left w:val="single" w:color="8EA9C1" w:sz="4"/>
@@ -6318,7 +6553,7 @@
         </w:tc>
         <w:tc>
           <w:tcPr>
-            <w:tcW w:type="dxa" w:w="2000"/>
+            <w:tcW w:type="dxa" w:w="1700"/>
             <w:tcBorders>
               <w:top w:val="single" w:color="8EA9C1" w:sz="4"/>
               <w:left w:val="single" w:color="8EA9C1" w:sz="4"/>
@@ -6352,7 +6587,7 @@
         </w:tc>
         <w:tc>
           <w:tcPr>
-            <w:tcW w:type="dxa" w:w="2200"/>
+            <w:tcW w:type="dxa" w:w="1700"/>
             <w:tcBorders>
               <w:top w:val="single" w:color="8EA9C1" w:sz="4"/>
               <w:left w:val="single" w:color="8EA9C1" w:sz="4"/>
@@ -6386,7 +6621,7 @@
         </w:tc>
         <w:tc>
           <w:tcPr>
-            <w:tcW w:type="dxa" w:w="1700"/>
+            <w:tcW w:type="dxa" w:w="1500"/>
             <w:tcBorders>
               <w:top w:val="single" w:color="8EA9C1" w:sz="4"/>
               <w:left w:val="single" w:color="8EA9C1" w:sz="4"/>
@@ -6420,7 +6655,7 @@
         </w:tc>
         <w:tc>
           <w:tcPr>
-            <w:tcW w:type="dxa" w:w="1700"/>
+            <w:tcW w:type="dxa" w:w="1600"/>
             <w:tcBorders>
               <w:top w:val="single" w:color="8EA9C1" w:sz="4"/>
               <w:left w:val="single" w:color="8EA9C1" w:sz="4"/>
@@ -6449,6 +6684,40 @@
                 <w:szCs w:val="18"/>
               </w:rPr>
               <w:t xml:space="preserve">Hors périmètre du POC</w:t>
+            </w:r>
+          </w:p>
+        </w:tc>
+        <w:tc>
+          <w:tcPr>
+            <w:tcW w:type="dxa" w:w="2100"/>
+            <w:tcBorders>
+              <w:top w:val="single" w:color="8EA9C1" w:sz="4"/>
+              <w:left w:val="single" w:color="8EA9C1" w:sz="4"/>
+              <w:bottom w:val="single" w:color="8EA9C1" w:sz="4"/>
+              <w:right w:val="single" w:color="8EA9C1" w:sz="4"/>
+            </w:tcBorders>
+            <w:tcMar>
+              <w:top w:type="dxa" w:w="60"/>
+              <w:left w:type="dxa" w:w="90"/>
+              <w:bottom w:type="dxa" w:w="60"/>
+              <w:right w:type="dxa" w:w="90"/>
+            </w:tcMar>
+            <w:vAlign w:val="center"/>
+          </w:tcPr>
+          <w:p>
+            <w:pPr>
+              <w:spacing w:after="0"/>
+            </w:pPr>
+            <w:r>
+              <w:rPr>
+                <w:rFonts w:ascii="Calibri" w:cs="Calibri" w:eastAsia="Calibri" w:hAnsi="Calibri"/>
+                <w:i/>
+                <w:iCs/>
+                <w:color w:val="808080"/>
+                <w:sz w:val="18"/>
+                <w:szCs w:val="18"/>
+              </w:rPr>
+              <w:t xml:space="preserve">p. 7 (Les offres partenaires)</w:t>
             </w:r>
           </w:p>
         </w:tc>
@@ -6465,6 +6734,35 @@
           <w:szCs w:val="21"/>
         </w:rPr>
         <w:t xml:space="preserve"/>
+      </w:r>
+    </w:p>
+    <w:p>
+      <w:pPr>
+        <w:spacing w:after="80"/>
+      </w:pPr>
+      <w:r>
+        <w:rPr>
+          <w:rFonts w:ascii="Calibri" w:cs="Calibri" w:eastAsia="Calibri" w:hAnsi="Calibri"/>
+          <w:b/>
+          <w:bCs/>
+          <w:color w:val="1F4E79"/>
+          <w:sz w:val="21"/>
+          <w:szCs w:val="21"/>
+        </w:rPr>
+        <w:t xml:space="preserve">S1 : ERP SAP WorldMobility (hypothèse de travail)</w:t>
+      </w:r>
+    </w:p>
+    <w:p>
+      <w:pPr>
+        <w:spacing w:after="120"/>
+      </w:pPr>
+      <w:r>
+        <w:rPr>
+          <w:rFonts w:ascii="Calibri" w:cs="Calibri" w:eastAsia="Calibri" w:hAnsi="Calibri"/>
+          <w:sz w:val="20"/>
+          <w:szCs w:val="20"/>
+        </w:rPr>
+        <w:t xml:space="preserve">Le sujet (p. 2) indique seulement que l'ED actuel est alimenté par des extractions de l'ERP SAP. Nous supposons que l'ERP fournit les mêmes données d'activité que l'ED V1 : achats (quantité), réservations (nombre d'exemplaires, date de réservation, durée prévue) et locations (durée), rattachés à un employé, un produit ou un exemplaire et une date. Hypothèse soumise au client (question 1).</w:t>
       </w:r>
     </w:p>
     <w:p>
@@ -7003,35 +7301,15 @@
     </w:p>
     <w:p>
       <w:pPr>
-        <w:pStyle w:val="ListParagraph"/>
-        <w:numPr>
-          <w:ilvl w:val="0"/>
-          <w:numId w:val="2"/>
-        </w:numPr>
-        <w:spacing w:after="60"/>
+        <w:spacing w:after="120"/>
       </w:pPr>
       <w:r>
         <w:rPr>
-          <w:sz w:val="20"/>
-          <w:szCs w:val="20"/>
-        </w:rPr>
-        <w:t xml:space="preserve">RG11 : les fichiers contiennent l'identité des salariés et leur société, sans indication de métier : la dimension métier sera « non renseigné » pour ces salariés.</w:t>
-      </w:r>
-    </w:p>
-    <w:p>
-      <w:pPr>
-        <w:spacing w:after="80"/>
-      </w:pPr>
-      <w:r>
-        <w:rPr>
           <w:rFonts w:ascii="Calibri" w:cs="Calibri" w:eastAsia="Calibri" w:hAnsi="Calibri"/>
-          <w:b/>
-          <w:bCs/>
-          <w:color w:val="1F4E79"/>
-          <w:sz w:val="21"/>
-          <w:szCs w:val="21"/>
-        </w:rPr>
-        <w:t xml:space="preserve">S5 : Référentiels externes</w:t>
+          <w:sz w:val="20"/>
+          <w:szCs w:val="20"/>
+        </w:rPr>
+        <w:t xml:space="preserve">Hypothèse de travail (question 2 au client) : chaque fichier contient un identifiant de salarié propre au fichier, son nom, son prénom, sa société et la ville de la société.</w:t>
       </w:r>
     </w:p>
     <w:p>
@@ -7048,7 +7326,23 @@
           <w:sz w:val="20"/>
           <w:szCs w:val="20"/>
         </w:rPr>
-        <w:t xml:space="preserve">RG12 : chaque société française possède un type (microentreprise, PME, ETI, grande entreprise) et une catégorie juridique définie sur 3 niveaux (fichier Excel de l'INSEE).</w:t>
+        <w:t xml:space="preserve">RG11 : les fichiers contiennent l'identité des salariés et leur société, sans indication de métier : la dimension métier sera « non renseigné » pour ces salariés.</w:t>
+      </w:r>
+    </w:p>
+    <w:p>
+      <w:pPr>
+        <w:spacing w:after="80"/>
+      </w:pPr>
+      <w:r>
+        <w:rPr>
+          <w:rFonts w:ascii="Calibri" w:cs="Calibri" w:eastAsia="Calibri" w:hAnsi="Calibri"/>
+          <w:b/>
+          <w:bCs/>
+          <w:color w:val="1F4E79"/>
+          <w:sz w:val="21"/>
+          <w:szCs w:val="21"/>
+        </w:rPr>
+        <w:t xml:space="preserve">S5 : Référentiels externes</w:t>
       </w:r>
     </w:p>
     <w:p>
@@ -7065,7 +7359,82 @@
           <w:sz w:val="20"/>
           <w:szCs w:val="20"/>
         </w:rPr>
+        <w:t xml:space="preserve">RG12 : chaque société française possède un type (microentreprise, PME, ETI, grande entreprise) et une catégorie juridique définie sur 3 niveaux (fichier Excel de l'INSEE).</w:t>
+      </w:r>
+    </w:p>
+    <w:p>
+      <w:pPr>
+        <w:pStyle w:val="ListParagraph"/>
+        <w:numPr>
+          <w:ilvl w:val="0"/>
+          <w:numId w:val="2"/>
+        </w:numPr>
+        <w:spacing w:after="60"/>
+      </w:pPr>
+      <w:r>
+        <w:rPr>
+          <w:sz w:val="20"/>
+          <w:szCs w:val="20"/>
+        </w:rPr>
         <w:t xml:space="preserve">RG13 : pour les sociétés allemandes, seule la ville est connue. Le découpage administratif est : Land → district (Regierungsbezirk, absent dans 9 Länder) → arrondissement (Landkreis ou kreisfreie Stadt) → commune (Gemeinde). Les 3 villes-États (Berlin, Hambourg, Brême) n'ont ni district ni arrondissement.</w:t>
+      </w:r>
+    </w:p>
+    <w:p>
+      <w:pPr>
+        <w:spacing w:after="80"/>
+      </w:pPr>
+      <w:r>
+        <w:rPr>
+          <w:rFonts w:ascii="Calibri" w:cs="Calibri" w:eastAsia="Calibri" w:hAnsi="Calibri"/>
+          <w:b/>
+          <w:bCs/>
+          <w:color w:val="1F4E79"/>
+          <w:sz w:val="21"/>
+          <w:szCs w:val="21"/>
+        </w:rPr>
+        <w:t xml:space="preserve">S6 : Entrepôt de données actuel (V1)</w:t>
+      </w:r>
+    </w:p>
+    <w:p>
+      <w:pPr>
+        <w:spacing w:after="120"/>
+      </w:pPr>
+      <w:r>
+        <w:rPr>
+          <w:rFonts w:ascii="Calibri" w:cs="Calibri" w:eastAsia="Calibri" w:hAnsi="Calibri"/>
+          <w:sz w:val="20"/>
+          <w:szCs w:val="20"/>
+        </w:rPr>
+        <w:t xml:space="preserve">Schéma conceptuel et relationnel fournis par le sujet (figure 1 p. 3, schéma relationnel p. 3-4, dictionnaire en annexe 1). Il est reproduit page « 2c » du draw.io et sert de point de départ à l'ED V2.</w:t>
+      </w:r>
+    </w:p>
+    <w:p>
+      <w:pPr>
+        <w:spacing w:after="80"/>
+      </w:pPr>
+      <w:r>
+        <w:rPr>
+          <w:rFonts w:ascii="Calibri" w:cs="Calibri" w:eastAsia="Calibri" w:hAnsi="Calibri"/>
+          <w:b/>
+          <w:bCs/>
+          <w:color w:val="1F4E79"/>
+          <w:sz w:val="21"/>
+          <w:szCs w:val="21"/>
+        </w:rPr>
+        <w:t xml:space="preserve">S7 : Offres partenaires Alltricks</w:t>
+      </w:r>
+    </w:p>
+    <w:p>
+      <w:pPr>
+        <w:spacing w:after="120"/>
+      </w:pPr>
+      <w:r>
+        <w:rPr>
+          <w:rFonts w:ascii="Calibri" w:cs="Calibri" w:eastAsia="Calibri" w:hAnsi="Calibri"/>
+          <w:sz w:val="20"/>
+          <w:szCs w:val="20"/>
+        </w:rPr>
+        <w:t xml:space="preserve">Modélisation indicative (page « 2b ») : un partenaire propose des articles (pièces détachées et accessoires) avec une remise de 20 %. Source hors périmètre du prototype (question 7 au client).</w:t>
       </w:r>
     </w:p>
     <w:p>

</xml_diff>